<commit_message>
fix: part-1 report order
</commit_message>
<xml_diff>
--- a/part-1/3343_Бондаренко_Федор_Пименов_Пётр_ИДЗ1.docx
+++ b/part-1/3343_Бондаренко_Федор_Пименов_Пётр_ИДЗ1.docx
@@ -5061,7 +5061,17 @@
           <w:sz w:val="28"/>
           <w:szCs w:val="28"/>
         </w:rPr>
-        <w:t>4. Результаты полной верификации в Spin:</w:t>
+        <w:t>8</w:t>
+      </w:r>
+      <w:r>
+        <w:rPr>
+          <w:b/>
+          <w:bCs/>
+          <w:color w:val="000000"/>
+          <w:sz w:val="28"/>
+          <w:szCs w:val="28"/>
+        </w:rPr>
+        <w:t>. Результаты полной верификации в Spin:</w:t>
       </w:r>
     </w:p>
     <w:p>
@@ -6824,7 +6834,32 @@
           <w:lang w:val="en-US"/>
         </w:rPr>
         <w:tab/>
-        <w:t xml:space="preserve">5. </w:t>
+      </w:r>
+      <w:r>
+        <w:rPr>
+          <w:b/>
+          <w:bCs/>
+          <w:i w:val="false"/>
+          <w:iCs w:val="false"/>
+          <w:color w:val="000000"/>
+          <w:sz w:val="28"/>
+          <w:szCs w:val="28"/>
+          <w:lang w:val="en-US"/>
+        </w:rPr>
+        <w:t>9</w:t>
+      </w:r>
+      <w:r>
+        <w:rPr>
+          <w:b/>
+          <w:bCs/>
+          <w:i w:val="false"/>
+          <w:iCs w:val="false"/>
+          <w:color w:val="000000"/>
+          <w:sz w:val="28"/>
+          <w:szCs w:val="28"/>
+          <w:lang w:val="en-US"/>
+        </w:rPr>
+        <w:t xml:space="preserve">. </w:t>
       </w:r>
       <w:r>
         <w:rPr>
@@ -13035,7 +13070,7 @@
     </w:r>
     <w:r>
       <w:rPr/>
-      <w:t>7</w:t>
+      <w:t>14</w:t>
     </w:r>
     <w:r>
       <w:rPr/>

</xml_diff>